<commit_message>
Guía de estudio: sección de la Persona 4 actualizada con CCD
</commit_message>
<xml_diff>
--- a/presentacion/guia_restricciones_ml.docx
+++ b/presentacion/guia_restricciones_ml.docx
@@ -383,7 +383,7 @@
           </w:tcPr>
           <w:p>
             <w:r>
-              <w:t>Transformers y demo</w:t>
+              <w:t>Transformers y restricciones en inferencia</w:t>
             </w:r>
           </w:p>
         </w:tc>
@@ -399,7 +399,7 @@
           </w:tcPr>
           <w:p>
             <w:r>
-              <w:t>Mostrar constrained decoding sin reentrenar</w:t>
+              <w:t>Mostrar cómo corregir los logits de un Transformer sin reentrenarlo</w:t>
             </w:r>
           </w:p>
         </w:tc>
@@ -415,7 +415,7 @@
           </w:tcPr>
           <w:p>
             <w:r>
-              <w:t>Demo financiera libre vs. restringida</w:t>
+              <w:t>CCD sobre MAIRA-2: informe sin vs. con restricción + resultados</w:t>
             </w:r>
           </w:p>
         </w:tc>
@@ -1135,7 +1135,7 @@
               <w:t xml:space="preserve">Idea clave: </w:t>
             </w:r>
             <w:r>
-              <w:t>estructura válida no significa respuesta verdadera. Una gramática puede garantizar JSON válido y categorías permitidas; no garantiza que el razonamiento o diagnóstico del LLM sea correcto.</w:t>
+              <w:t>estructura válida no significa respuesta verdadera. Una gramática puede garantizar JSON válido y categorías permitidas; no garantiza que el razonamiento o diagnóstico del LLM sea correcto. Lo mismo vale para la versión blanda: un texto guiado por un experto no garantiza un diagnóstico correcto.</w:t>
             </w:r>
           </w:p>
         </w:tc>
@@ -1151,74 +1151,316 @@
         <w:pStyle w:val="Heading2"/>
       </w:pPr>
       <w:r>
-        <w:t>Demo recomendada: asistente financiero estructurado</w:t>
+        <w:rPr/>
+        <w:t>De la máscara dura al sesgo blando</w:t>
       </w:r>
     </w:p>
     <w:p>
+      <w:pPr/>
       <w:r>
-        <w:t>Para una demo atractiva y cotidiana, conviene usar datos financieros ficticios y mostrar que la restricción se aplica a la forma de salida, no a una decisión crediticia real. Python puede calcular primero indicadores deterministas y el Transformer producir un resumen estructurado.</w:t>
+        <w:rPr/>
+        <w:t>La máscara de −∞ es una restricción dura: la regla se cumple siempre. Existe una versión blanda: en lugar de prohibir un token, se suma un sesgo finito bk a su logit. El token se favorece (bk &gt; 0) o se desfavorece (bk &lt; 0), pero el modelo conserva la última palabra:</w:t>
+      </w:r>
+    </w:p>
+    <w:p>
+      <w:pPr>
+        <w:jc w:val="center"/>
+      </w:pPr>
+      <w:r>
+        <w:rPr>
+          <w:rFonts w:ascii="Cambria Math" w:hAnsi="Cambria Math"/>
+          <w:i/>
+          <w:sz w:val="24"/>
+        </w:rPr>
+        <w:t>z′k = zk + bk      ⇒      P′(k) / P′(j) = e^bk · P(k) / P(j)</w:t>
+      </w:r>
+    </w:p>
+    <w:p>
+      <w:pPr/>
+      <w:r>
+        <w:rPr/>
+        <w:t xml:space="preserve">Un </w:t>
+      </w:r>
+      <w:r>
+        <w:rPr>
+          <w:b/>
+        </w:rPr>
+        <w:t>logit</w:t>
+      </w:r>
+      <w:r>
+        <w:rPr/>
+        <w:t xml:space="preserve"> es, en su origen, el logaritmo de las odds: logit(p) = ln(p / (1 − p)) (Berkson, 1944 [17]). En un Transformer, los logits son las puntuaciones que la última capa lineal entrega al softmax. Sumar c al logit de un token multiplica sus odds frente a cualquier otro token por e^c, por eso intervenir los logits equivale a reponderar odds. Dos aclaraciones para no confundirse: dentro de cada capa hay otro softmax, el de la atención, que reparte pesos entre tokens y no elige palabras (su máscara causal de −∞ es, de hecho, una restricción dura de arquitectura); y entre capas viajan vectores de estado oculto, no logits.</w:t>
+      </w:r>
+    </w:p>
+    <w:p>
+      <w:pPr>
+        <w:pStyle w:val="Heading2"/>
+      </w:pPr>
+      <w:r>
+        <w:rPr/>
+        <w:t>Caso implementado: Clinical Contrastive Decoding (CCD)</w:t>
+      </w:r>
+    </w:p>
+    <w:p>
+      <w:pPr/>
+      <w:r>
+        <w:rPr/>
+        <w:t xml:space="preserve">MAIRA-2 [15] es un Transformer multimodal de 7 000 millones de parámetros que redacta el informe de una radiografía de tórax. Tiende a escribir el informe “normal” típico y a </w:t>
+      </w:r>
+      <w:r>
+        <w:rPr>
+          <w:b/>
+        </w:rPr>
+        <w:t>omitir hallazgos</w:t>
+      </w:r>
+      <w:r>
+        <w:rPr/>
+        <w:t>. CCD [14] corrige esto en la inferencia, sin tocar sus pesos, con la ayuda de un experto externo: una CNN (DenseNet-121 entrenada en CheXpert, de torchxrayvision) que mira la misma radiografía y estima la probabilidad pc de cada hallazgo (p. ej., p(cardiomegalia) = 0,82). En cada palabra generada:</w:t>
+      </w:r>
+    </w:p>
+    <w:p>
+      <w:pPr>
+        <w:pStyle w:val="ListBullet"/>
+      </w:pPr>
+      <w:r>
+        <w:rPr>
+          <w:b/>
+        </w:rPr>
+        <w:t xml:space="preserve">Guía clínica (α): </w:t>
+      </w:r>
+      <w:r>
+        <w:rPr/>
+        <w:t>el Transformer se corre dos veces, con la instrucción normal y con una nota que lista los hallazgos del experto, y se mezclan sus log-probabilidades.</w:t>
+      </w:r>
+    </w:p>
+    <w:p>
+      <w:pPr>
+        <w:pStyle w:val="ListBullet"/>
+      </w:pPr>
+      <w:r>
+        <w:rPr>
+          <w:b/>
+        </w:rPr>
+        <w:t xml:space="preserve">Sesgo experto (β, γ): </w:t>
+      </w:r>
+      <w:r>
+        <w:rPr/>
+        <w:t>a los tokens del nombre de cada hallazgo se les suma el logit del experto, acotado por γ.</w:t>
+      </w:r>
+    </w:p>
+    <w:p>
+      <w:pPr>
+        <w:pStyle w:val="ListBullet"/>
+      </w:pPr>
+      <w:r>
+        <w:rPr>
+          <w:b/>
+        </w:rPr>
+        <w:t xml:space="preserve">Decisión: </w:t>
+      </w:r>
+      <w:r>
+        <w:rPr/>
+        <w:t>softmax sobre los logits finales y selección greedy de la palabra.</w:t>
+      </w:r>
+    </w:p>
+    <w:p>
+      <w:pPr>
+        <w:jc w:val="center"/>
+      </w:pPr>
+      <w:r>
+        <w:rPr>
+          <w:rFonts w:ascii="Cambria Math" w:hAnsi="Cambria Math"/>
+          <w:i/>
+          <w:sz w:val="24"/>
+        </w:rPr>
+        <w:t>ℓguía = (1 − α) · ℓorig + α · ℓclín</w:t>
+      </w:r>
+    </w:p>
+    <w:p>
+      <w:pPr>
+        <w:jc w:val="center"/>
+      </w:pPr>
+      <w:r>
+        <w:rPr>
+          <w:rFonts w:ascii="Cambria Math" w:hAnsi="Cambria Math"/>
+          <w:i/>
+          <w:sz w:val="24"/>
+        </w:rPr>
+        <w:t>bc = clip( ln( pc / (1 − pc) ),  −ln γ,  +ln γ )</w:t>
+      </w:r>
+    </w:p>
+    <w:p>
+      <w:pPr>
+        <w:jc w:val="center"/>
+      </w:pPr>
+      <w:r>
+        <w:rPr>
+          <w:rFonts w:ascii="Cambria Math" w:hAnsi="Cambria Math"/>
+          <w:i/>
+          <w:sz w:val="24"/>
+        </w:rPr>
+        <w:t>ℓfinal = ℓguía + β · b</w:t>
+      </w:r>
+    </w:p>
+    <w:p>
+      <w:pPr>
+        <w:jc w:val="center"/>
+      </w:pPr>
+      <w:r>
+        <w:rPr>
+          <w:rFonts w:ascii="Cambria Math" w:hAnsi="Cambria Math"/>
+          <w:i/>
+          <w:sz w:val="24"/>
+        </w:rPr>
+        <w:t>Pfinal(v) ∝ Porig(v)^(1−α) · Pclín(v)^α · ( pc / (1 − pc) )^β</w:t>
+      </w:r>
+    </w:p>
+    <w:p>
+      <w:pPr/>
+      <w:r>
+        <w:rPr/>
+        <w:t xml:space="preserve">α, β y γ son </w:t>
+      </w:r>
+      <w:r>
+        <w:rPr>
+          <w:b/>
+        </w:rPr>
+        <w:t>hiperparámetros</w:t>
+      </w:r>
+      <w:r>
+        <w:rPr/>
+        <w:t>: α controla cuánto escucha el modelo la nota del experto; β, cuánto empuja el experto (cumple un papel análogo al λ de la penalización suave de la Persona 2); γ, hasta dónde se le permite empujar (con γ → ∞ y pc → 0 se recupera la máscara dura de −∞). Usamos los valores del artículo, α = β = 0,5 y γ = 10, sin ajustarlos sobre los datos de prueba. Con ellos, el sesgo directo del experto multiplica o divide las odds de un token como máximo por γ^β = √10 ≈ 3,16; la mezcla con α no tiene ese tope.</w:t>
+      </w:r>
+    </w:p>
+    <w:p>
+      <w:pPr/>
+      <w:r>
+        <w:rPr/>
+        <w:t xml:space="preserve">¿Por qué no usar solo el experto? </w:t>
+      </w:r>
+      <w:r>
+        <w:rPr>
+          <w:b/>
+        </w:rPr>
+        <w:t>DenseNet clasifica; MAIRA-2 redacta.</w:t>
+      </w:r>
+      <w:r>
+        <w:rPr/>
+        <w:t xml:space="preserve"> El experto entrega 14 probabilidades; el informe necesita severidad (“mildly enlarged”), ubicación y hallazgos negativos. Además, el experto marca de más: en el caso estudiado señaló fractura (0,70), que el radiólogo no reportó y que el informe con CCD no escribió. La restricción blanda deja que el Transformer pondere la evidencia.</w:t>
+      </w:r>
+    </w:p>
+    <w:p>
+      <w:pPr>
+        <w:pStyle w:val="Heading2"/>
+      </w:pPr>
+      <w:r>
+        <w:rPr/>
+        <w:t>Ejemplo numérico (ilustrativo)</w:t>
+      </w:r>
+    </w:p>
+    <w:p>
+      <w:pPr/>
+      <w:r>
+        <w:rPr/>
+        <w:t>El modelo va a describir el corazón y duda entre dos palabras. Así cambia la probabilidad de la siguiente palabra en cada etapa (p(cardiomegalia) = 0,82 es el valor real que dio el experto en el estudio 148 del experimento):</w:t>
       </w:r>
     </w:p>
     <w:p>
       <w:pPr>
         <w:pStyle w:val="CodeBlock"/>
-        <w:spacing w:before="80" w:after="160"/>
-        <w:shd w:fill="F4F6F8"/>
-        <w:pBdr>
-          <w:bottom w:val="single" w:sz="4" w:color="D9E2F3"/>
-        </w:pBdr>
       </w:pPr>
       <w:r>
         <w:rPr>
           <w:rFonts w:ascii="Liberation Mono" w:hAnsi="Liberation Mono"/>
           <w:sz w:val="19"/>
         </w:rPr>
-        <w:t>Ingreso mensual: 5 000 000</w:t>
+        <w:t>Etapa                            normal   cardiomegaly   otra</w:t>
         <w:br/>
-        <w:t>Gastos mensuales (sin deuda): 3 500 000</w:t>
+        <w:t>1. Transformer original           50 %       30 %         20 %</w:t>
         <w:br/>
-        <w:t>Deuda mensual: 1 100 000</w:t>
+        <w:t>2. Con la nota del experto        30 %       55 %         15 %</w:t>
         <w:br/>
-        <w:t>Utilización de tarjeta: 72 %</w:t>
+        <w:t>3. Mezcla (α = 0,5)               40 %       42 %         18 %</w:t>
         <w:br/>
-        <w:t>Flujo de caja: 5 000 000 − 3 500 000 − 1 100 000 = 400 000</w:t>
+        <w:t>4. × odds del experto (β = 0,5)   27 %       61 %         12 %</w:t>
       </w:r>
     </w:p>
     <w:p>
+      <w:pPr/>
       <w:r>
-        <w:t>La salida objetivo puede estar limitada a campos y categorías concretas:</w:t>
+        <w:rPr/>
+        <w:t>La palabra elegida pasa a ser contexto de todas las siguientes (efecto bola de nieve): en el caso real, el informe original decía “Cardiac and mediastinal contours are normal” y el informe con CCD, “The cardiac silhouette is mildly enlarged”.</w:t>
+      </w:r>
+    </w:p>
+    <w:p>
+      <w:pPr>
+        <w:pStyle w:val="Heading2"/>
+      </w:pPr>
+      <w:r>
+        <w:rPr/>
+        <w:t>Resultados del experimento</w:t>
+      </w:r>
+    </w:p>
+    <w:p>
+      <w:pPr/>
+      <w:r>
+        <w:rPr/>
+        <w:t>Datos: IU X-Ray [18], 30 estudios con al menos uno de los 5 hallazgos principales según el radiólogo. Evaluación con CheXbert [16], que etiqueta 14 hallazgos en cada informe; métricas micro e IC 95 % por bootstrap pareado (2000 remuestreos). Código oficial de CCD, GPU A100.</w:t>
       </w:r>
     </w:p>
     <w:p>
       <w:pPr>
         <w:pStyle w:val="CodeBlock"/>
-        <w:spacing w:before="80" w:after="160"/>
-        <w:shd w:fill="F4F6F8"/>
-        <w:pBdr>
-          <w:bottom w:val="single" w:sz="4" w:color="D9E2F3"/>
-        </w:pBdr>
       </w:pPr>
       <w:r>
         <w:rPr>
           <w:rFonts w:ascii="Liberation Mono" w:hAnsi="Liberation Mono"/>
           <w:sz w:val="19"/>
         </w:rPr>
-        <w:t>{</w:t>
+        <w:t>Métrica (micro)        5 hallazgos principales      14 hallazgos</w:t>
         <w:br/>
-        <w:t xml:space="preserve">  "nivel_utilizacion": "bajo | medio | alto",</w:t>
+        <w:t>Precisión              1,000 → 0,625                0,031 → 0,161</w:t>
         <w:br/>
-        <w:t xml:space="preserve">  "flujo_caja": "positivo | negativo",</w:t>
+        <w:t>Recall                 0,030 → 0,152                0,019 → 0,094</w:t>
         <w:br/>
-        <w:t xml:space="preserve">  "prioridad": "ahorro | deuda | equilibrio",</w:t>
+        <w:t>F1                     0,059 → 0,244                0,024 → 0,119</w:t>
         <w:br/>
-        <w:t xml:space="preserve">  "explicacion": "..."</w:t>
+        <w:t>AUC                    0,515 → 0,563                0,467 → 0,512</w:t>
         <w:br/>
-        <w:t>}</w:t>
+        <w:t>P(mejora) bootstrap    37 % / 95 % / 95 % / 93 %     95–98 %</w:t>
       </w:r>
     </w:p>
     <w:p>
+      <w:pPr/>
       <w:r>
-        <w:t>Primero se genera libremente: el modelo puede añadir Markdown, omitir campos, inventar categorías o romper el JSON. Después se usa constrained decoding con un esquema o gramática y se demuestra que la estructura sí puede garantizarse.</w:t>
+        <w:rPr/>
+        <w:t xml:space="preserve">Referencia del artículo (3307 estudios): CheXbert-F1 en 5 hallazgos de 4,02 a 19,96. </w:t>
+      </w:r>
+      <w:r>
+        <w:rPr>
+          <w:b/>
+        </w:rPr>
+        <w:t>Lectura honesta:</w:t>
+      </w:r>
+      <w:r>
+        <w:rPr/>
+        <w:t xml:space="preserve"> la ganancia se concentra en cardiomegalia (0/20 → 5/20 detectadas) y la atelectasia empeoró (1/10 → 0/10); por paciente, mejoró en 6, igual en 21 y empeoró en 3; el costo de inferencia pasa de ~1,4 s a ~11,5 s por informe; y el experto tiene un AUC modesto (0,61) en estos estudios. La precisión de 1,000 del original engaña: mencionó un solo hallazgo en 30 estudios.</w:t>
+      </w:r>
+    </w:p>
+    <w:p>
+      <w:pPr>
+        <w:pStyle w:val="Heading2"/>
+      </w:pPr>
+      <w:r>
+        <w:rPr/>
+        <w:t>Cuándo una restricción no ayuda</w:t>
+      </w:r>
+    </w:p>
+    <w:p>
+      <w:pPr/>
+      <w:r>
+        <w:rPr/>
+        <w:t>Antes de CCD probamos restricciones post-entrenamiento sobre BiomedCLIP en PatchCamelyon: promediar sobre las 8 rotaciones/reflexiones (D4) solo sube el AUC de 0,825 a 0,832, aunque elimina el 30,6 % de diagnósticos que cambiaban al girar el parche; normalizar la tinción lo baja a 0,738. El modelo ya era casi invariante al giro, y el color sí era información útil. Una restricción ayuda en la medida en que el modelo viola la regla que impone.</w:t>
       </w:r>
     </w:p>
     <w:tbl>
@@ -1251,7 +1493,7 @@
               <w:t xml:space="preserve">Pregunta para el público: </w:t>
             </w:r>
             <w:r>
-              <w:t>“¿Cuál de estas dos salidas podría consumir directamente otra aplicación sin escribir un parser lleno de excepciones?”. Después preguntar: “¿que el JSON sea válido significa que el diagnóstico financiero sea correcto?”. La respuesta a la segunda pregunta es no.</w:t>
+              <w:t>“Si el experto ya ve la cardiomegalia, ¿para qué el Transformer?”. Respuesta: el experto clasifica y el Transformer redacta; CCD combina ambos sin reentrenar ninguno. Segunda pregunta: “¿un informe guiado por un experto es un diagnóstico correcto?”. No: la restricción vale lo que vale el conocimiento que la alimenta.</w:t>
             </w:r>
           </w:p>
         </w:tc>
@@ -1505,7 +1747,7 @@
           </w:tcPr>
           <w:p>
             <w:r>
-              <w:t>Generación autorregresiva, logits, token masking, gramáticas</w:t>
+              <w:t>Generación autorregresiva, logits, máscara dura vs. sesgo blando, CCD (α, β, γ)</w:t>
             </w:r>
           </w:p>
         </w:tc>
@@ -1521,7 +1763,7 @@
           </w:tcPr>
           <w:p>
             <w:r>
-              <w:t>Demo financiera libre vs. restringida</w:t>
+              <w:t>Caso real de radiografía + métricas antes/después</w:t>
             </w:r>
           </w:p>
         </w:tc>
@@ -1571,7 +1813,7 @@
           </w:tcPr>
           <w:p>
             <w:r>
-              <w:t>“Precisión ≠ validez” y “estructura válida ≠ verdad”</w:t>
+              <w:t>“Precisión ≠ validez”, “estructura válida ≠ verdad” y “texto guiado ≠ diagnóstico correcto”</w:t>
             </w:r>
           </w:p>
         </w:tc>
@@ -1833,6 +2075,91 @@
         </w:r>
       </w:hyperlink>
     </w:p>
+    <w:p>
+      <w:pPr>
+        <w:ind w:left="216" w:hanging="216"/>
+      </w:pPr>
+      <w:r>
+        <w:t xml:space="preserve">[14] Zhang, X., Meng, Z., Lever, J., &amp; Ho, E. S. L. (2026). CCD: Mitigating Hallucinations in Radiology MLLMs via Clinical Contrastive Decoding. ACL 2026. </w:t>
+      </w:r>
+      <w:hyperlink r:id="rId22">
+        <w:r>
+          <w:rPr>
+            <w:color w:val="0563C1"/>
+            <w:u w:val="single"/>
+          </w:rPr>
+          <w:t>Enlace</w:t>
+        </w:r>
+      </w:hyperlink>
+    </w:p>
+    <w:p>
+      <w:pPr>
+        <w:ind w:left="216" w:hanging="216"/>
+      </w:pPr>
+      <w:r>
+        <w:t xml:space="preserve">[15] Bannur, S., et al. (2024). MAIRA-2: Grounded Radiology Report Generation. Microsoft Research. </w:t>
+      </w:r>
+      <w:hyperlink r:id="rId23">
+        <w:r>
+          <w:rPr>
+            <w:color w:val="0563C1"/>
+            <w:u w:val="single"/>
+          </w:rPr>
+          <w:t>Enlace</w:t>
+        </w:r>
+      </w:hyperlink>
+    </w:p>
+    <w:p>
+      <w:pPr>
+        <w:ind w:left="216" w:hanging="216"/>
+      </w:pPr>
+      <w:r>
+        <w:t xml:space="preserve">[16] Smit, A., Jain, S., Rajpurkar, P., Pareek, A., Ng, A. Y., &amp; Lungren, M. P. (2020). CheXbert: Combining Automatic Labelers and Expert Annotations for Accurate Radiology Report Labeling Using BERT. EMNLP 2020. </w:t>
+      </w:r>
+      <w:hyperlink r:id="rId24">
+        <w:r>
+          <w:rPr>
+            <w:color w:val="0563C1"/>
+            <w:u w:val="single"/>
+          </w:rPr>
+          <w:t>Enlace</w:t>
+        </w:r>
+      </w:hyperlink>
+    </w:p>
+    <w:p>
+      <w:pPr>
+        <w:ind w:left="216" w:hanging="216"/>
+      </w:pPr>
+      <w:r>
+        <w:t xml:space="preserve">[17] Berkson, J. (1944). Application of the Logistic Function to Bio-Assay. Journal of the American Statistical Association, 39(227), 357–365. </w:t>
+      </w:r>
+      <w:hyperlink r:id="rId25">
+        <w:r>
+          <w:rPr>
+            <w:color w:val="0563C1"/>
+            <w:u w:val="single"/>
+          </w:rPr>
+          <w:t>Enlace</w:t>
+        </w:r>
+      </w:hyperlink>
+    </w:p>
+    <w:p>
+      <w:pPr>
+        <w:ind w:left="216" w:hanging="216"/>
+      </w:pPr>
+      <w:r>
+        <w:t xml:space="preserve">[18] Demner-Fushman, D., et al. (2016). Preparing a collection of radiology examinations for distribution and retrieval. JAMIA, 23(2), 304–310. </w:t>
+      </w:r>
+      <w:hyperlink r:id="rId26">
+        <w:r>
+          <w:rPr>
+            <w:color w:val="0563C1"/>
+            <w:u w:val="single"/>
+          </w:rPr>
+          <w:t>Enlace</w:t>
+        </w:r>
+      </w:hyperlink>
+    </w:p>
     <w:tbl>
       <w:tblPr>
         <w:tblW w:type="auto" w:w="0"/>
@@ -1863,7 +2190,7 @@
               <w:t xml:space="preserve">Nota de alcance: </w:t>
             </w:r>
             <w:r>
-              <w:t>las restricciones monotónicas, físicas o de negocio solo son correctas si están justificadas por el dominio. Imponer una regla equivocada puede degradar un modelo. En Transformers, constrained decoding puede garantizar forma o sintaxis, pero no garantiza veracidad, causalidad ni calidad semántica.</w:t>
+              <w:t>las restricciones monotónicas, físicas o de negocio solo son correctas si están justificadas por el dominio. Imponer una regla equivocada puede degradar un modelo. En Transformers, constrained decoding puede garantizar forma o sintaxis, pero no garantiza veracidad, causalidad ni calidad semántica. Una restricción blanda como CCD mejora el recall clínico, pero hereda los errores del experto que la guía.</w:t>
             </w:r>
           </w:p>
         </w:tc>

</xml_diff>